<commit_message>
Finished Gherkin scenarios and updated the report
</commit_message>
<xml_diff>
--- a/Task 3 report.docx
+++ b/Task 3 report.docx
@@ -74,14 +74,7 @@
       <w:r>
         <w:rPr/>
         <w:tab/>
-      </w:r>
-      <w:r>
-        <w:rPr/>
-        <w:t xml:space="preserve">In Assignment 1 this class did not exist and instead </w:t>
-      </w:r>
-      <w:r>
-        <w:rPr/>
-        <w:t xml:space="preserve">it's role was fulfilled by the Server class instead that was also responsible for handling networking. In Assignment 3 I have created CustomerController to separate responcibilities of the classes. </w:t>
+        <w:t xml:space="preserve">In Assignment 1 this class did not exist and instead it's role was fulfilled by the Server class instead that was also responsible for handling networking. In Assignment 3 I have created CustomerController to separate responcibilities of the classes. </w:t>
       </w:r>
     </w:p>
     <w:p>
@@ -105,7 +98,27 @@
       <w:r>
         <w:rPr/>
         <w:tab/>
-        <w:t>Now CustomerController is responsible for loading and saving all customers from database, managing cookies (session tockens) as well as handling data from the requests providing by the Server class.</w:t>
+        <w:t>Now CustomerController is responsible for loading and saving all customers from database, managing cookies (session tockens) as well as handling data from the requests</w:t>
+      </w:r>
+      <w:r>
+        <w:rPr/>
+        <w:t xml:space="preserve"> parsed and</w:t>
+      </w:r>
+      <w:r>
+        <w:rPr/>
+        <w:t xml:space="preserve"> provid</w:t>
+      </w:r>
+      <w:r>
+        <w:rPr/>
+        <w:t>ed</w:t>
+      </w:r>
+      <w:r>
+        <w:rPr/>
+        <w:t xml:space="preserve"> by the Server class.</w:t>
+      </w:r>
+      <w:r>
+        <w:rPr/>
+        <w:t xml:space="preserve"> It also keeps Dictionary of the instances of the Account classes indexed by their ID to allow to make transactions without knowing login of the other Customer.</w:t>
       </w:r>
     </w:p>
     <w:p>
@@ -180,7 +193,126 @@
       <w:r>
         <w:rPr/>
         <w:tab/>
-        <w:t>It made me change this relationship to one-to-one: now class Customer was responsible for handling password, contact data and login. Account on the other hand was responsible for containing the balance and handling the transactions. This also allowed for better security as now with new requirement of inter-account transactions it was possible to deposit money to someone else's account without knowing their login, thus lowering risk of someone attempting to hack an account the money were sent to, as without knowing login and password it is impossible to withdraw money from an account.</w:t>
+        <w:t>It made me change this relationship to one-to-one: now class Customer was responsible</w:t>
+      </w:r>
+      <w:r>
+        <w:rPr/>
+        <w:t xml:space="preserve"> for </w:t>
+      </w:r>
+      <w:r>
+        <w:rPr/>
+        <w:t>handling password, contact data and login</w:t>
+      </w:r>
+      <w:r>
+        <w:rPr/>
+        <w:t xml:space="preserve"> and managing transaction requests by calling transaction verification methods of the only one account class that it holds</w:t>
+      </w:r>
+      <w:r>
+        <w:rPr/>
+        <w:t xml:space="preserve">. </w:t>
+      </w:r>
+    </w:p>
+    <w:p>
+      <w:pPr>
+        <w:pStyle w:val="Normal"/>
+        <w:bidi w:val="0"/>
+        <w:jc w:val="start"/>
+        <w:rPr/>
+      </w:pPr>
+      <w:r>
+        <w:rPr/>
+      </w:r>
+    </w:p>
+    <w:p>
+      <w:pPr>
+        <w:pStyle w:val="Normal"/>
+        <w:bidi w:val="0"/>
+        <w:jc w:val="start"/>
+        <w:rPr/>
+      </w:pPr>
+      <w:r>
+        <w:rPr/>
+        <w:tab/>
+      </w:r>
+      <w:r>
+        <w:rPr/>
+        <w:t xml:space="preserve">Account on the other hand </w:t>
+      </w:r>
+      <w:r>
+        <w:rPr/>
+        <w:t>now became</w:t>
+      </w:r>
+      <w:r>
+        <w:rPr/>
+        <w:t xml:space="preserve"> responsible for containing the balance and</w:t>
+      </w:r>
+      <w:r>
+        <w:rPr/>
+        <w:t xml:space="preserve"> processing and</w:t>
+      </w:r>
+      <w:r>
+        <w:rPr/>
+        <w:t xml:space="preserve"> </w:t>
+      </w:r>
+      <w:r>
+        <w:rPr/>
+        <w:t>veryfying</w:t>
+      </w:r>
+      <w:r>
+        <w:rPr/>
+        <w:t xml:space="preserve"> the transactions. This also allowed for better security as now with new requirement of inter-account transactions it was possible to deposit money to someone else's account without knowing their login, thus lowering risk of someone attempting to hack an account the money were sent to, as without knowing login and password it is impossible to withdraw money from an account.</w:t>
+      </w:r>
+    </w:p>
+    <w:p>
+      <w:pPr>
+        <w:pStyle w:val="Normal"/>
+        <w:bidi w:val="0"/>
+        <w:jc w:val="start"/>
+        <w:rPr/>
+      </w:pPr>
+      <w:r>
+        <w:rPr/>
+      </w:r>
+    </w:p>
+    <w:p>
+      <w:pPr>
+        <w:pStyle w:val="Normal"/>
+        <w:bidi w:val="0"/>
+        <w:jc w:val="start"/>
+        <w:rPr/>
+      </w:pPr>
+      <w:r>
+        <w:rPr/>
+        <w:tab/>
+        <w:t xml:space="preserve">Additonally, Customer class had new "Serialize()" class added in addition to the "ToString()" method. While "ToString()" is responsible for sending the data that excludes password and pin and is meant to be used for viewing account info on the client, </w:t>
+      </w:r>
+      <w:r>
+        <w:rPr/>
+        <w:t>"S</w:t>
+      </w:r>
+      <w:r>
+        <w:rPr/>
+        <w:t>erialize</w:t>
+      </w:r>
+      <w:r>
+        <w:rPr/>
+        <w:t>()"</w:t>
+      </w:r>
+      <w:r>
+        <w:rPr/>
+        <w:t xml:space="preserve"> </w:t>
+      </w:r>
+      <w:r>
+        <w:rPr/>
+        <w:t>sends</w:t>
+      </w:r>
+      <w:r>
+        <w:rPr/>
+        <w:t xml:space="preserve"> all account details to allow</w:t>
+      </w:r>
+      <w:r>
+        <w:rPr/>
+        <w:t xml:space="preserve"> to save all data inbetween sessions.</w:t>
       </w:r>
     </w:p>
     <w:sectPr>
@@ -190,6 +322,7 @@
       <w:pgNumType w:fmt="decimal"/>
       <w:formProt w:val="false"/>
       <w:textDirection w:val="lrTb"/>
+      <w:docGrid w:type="default" w:linePitch="100" w:charSpace="0"/>
     </w:sectPr>
   </w:body>
 </w:document>
@@ -209,7 +342,6 @@
     </w:rPrDefault>
     <w:pPrDefault>
       <w:pPr>
-        <w:widowControl/>
         <w:suppressAutoHyphens w:val="true"/>
       </w:pPr>
     </w:pPrDefault>
@@ -219,7 +351,10 @@
     <w:qFormat/>
     <w:pPr>
       <w:widowControl/>
+      <w:suppressAutoHyphens w:val="true"/>
       <w:bidi w:val="0"/>
+      <w:spacing w:before="0" w:after="0"/>
+      <w:jc w:val="start"/>
     </w:pPr>
     <w:rPr>
       <w:rFonts w:ascii="Liberation Serif" w:hAnsi="Liberation Serif" w:eastAsia="Noto Serif CJK SC" w:cs="FreeSans"/>

</xml_diff>